<commit_message>
docs: replace environment-specific AWS profile
</commit_message>
<xml_diff>
--- a/docs/planning/bedrock-local-proxy/bedrock-local-proxy-product-brief.docx
+++ b/docs/planning/bedrock-local-proxy/bedrock-local-proxy-product-brief.docx
@@ -300,7 +300,7 @@
         <w:pStyle w:val="CodeBlock"/>
       </w:pPr>
       <w:r>
-        <w:t>aws sso login --profile Halo-Win-Agent-Execution</w:t>
+        <w:t>aws sso login --profile YOUR_AWS_PROFILE</w:t>
         <w:br/>
         <w:br/>
         <w:t>bedrock-proxy</w:t>
@@ -476,7 +476,7 @@
         <w:br/>
         <w:t>aws:</w:t>
         <w:br/>
-        <w:t xml:space="preserve">  profile: Halo-Win-Agent-Execution</w:t>
+        <w:t xml:space="preserve">  profile: YOUR_AWS_PROFILE</w:t>
         <w:br/>
         <w:t xml:space="preserve">  region: us-east-2</w:t>
         <w:br/>
@@ -557,7 +557,7 @@
         <w:br/>
         <w:t>Listening:   http://127.0.0.1:8787/v1</w:t>
         <w:br/>
-        <w:t>AWS profile: Halo-Win-Agent-Execution</w:t>
+        <w:t>AWS profile: YOUR_AWS_PROFILE</w:t>
         <w:br/>
         <w:t>Region:      us-east-2</w:t>
         <w:br/>
@@ -660,7 +660,7 @@
         <w:pStyle w:val="CodeBlock"/>
       </w:pPr>
       <w:r>
-        <w:t>aws sso login --profile Halo-Win-Agent-Execution</w:t>
+        <w:t>aws sso login --profile YOUR_AWS_PROFILE</w:t>
       </w:r>
     </w:p>
     <w:p>
@@ -673,13 +673,13 @@
         <w:pStyle w:val="CodeBlock"/>
       </w:pPr>
       <w:r>
-        <w:t>AWS authentication expired for profile Halo-Win-Agent-Execution.</w:t>
+        <w:t>AWS authentication expired for profile YOUR_AWS_PROFILE.</w:t>
         <w:br/>
         <w:br/>
         <w:t>Run:</w:t>
         <w:br/>
         <w:br/>
-        <w:t xml:space="preserve">  aws sso login --profile Halo-Win-Agent-Execution</w:t>
+        <w:t xml:space="preserve">  aws sso login --profile YOUR_AWS_PROFILE</w:t>
       </w:r>
     </w:p>
     <w:p>

</xml_diff>